<commit_message>
Correct one remaining vendor-claim TTS figure in PMP non-goals
Co-Authored-By: Claude Opus 5 <noreply@anthropic.com>
</commit_message>
<xml_diff>
--- a/docs/voice-platform/07-project-management-plan.docx
+++ b/docs/voice-platform/07-project-management-plan.docx
@@ -959,7 +959,22 @@
                 <w:rFonts w:ascii="Nirmala UI" w:hAnsi="Nirmala UI" w:eastAsia="Nirmala UI" w:cs="Nirmala UI"/>
                 <w:sz w:val="18"/>
               </w:rPr>
-              <w:t>Not achievable by anyone — it is below PSTN round-trip. That figure is a single-component TTS number (~40 ms time-to-first-audio), not conversational latency. Best measured platform on real calls: 1,296 ms.</w:t>
+              <w:t xml:space="preserve">Not achievable by anyone — it is below PSTN round-trip. That figure is a single-component number — OpenAI Realtime's 80–120 ms </w:t>
+            </w:r>
+            <w:r>
+              <w:rPr>
+                <w:rFonts w:ascii="Nirmala UI" w:hAnsi="Nirmala UI" w:eastAsia="Nirmala UI" w:cs="Nirmala UI"/>
+                <w:i/>
+                <w:sz w:val="18"/>
+              </w:rPr>
+              <w:t>processing</w:t>
+            </w:r>
+            <w:r>
+              <w:rPr>
+                <w:rFonts w:ascii="Nirmala UI" w:hAnsi="Nirmala UI" w:eastAsia="Nirmala UI" w:cs="Nirmala UI"/>
+                <w:sz w:val="18"/>
+              </w:rPr>
+              <w:t xml:space="preserve"> latency, or a vendor TTS claim — not conversational latency. Best measured platform on real calls: 1,296 ms.</w:t>
             </w:r>
           </w:p>
         </w:tc>

</xml_diff>